<commit_message>
Argos 3.1.2-beta: guidelines and templates aligned with the Intelligence Field Notes
- Report templates grade sources on the UNODC 4 x 4 scale (was 6 x 6
  Admiralty) and name the one ICD 203 likelihood row to use.
- docs/guidelines.md keeps only what is specific to Argos; the common
  method is in the Intelligence Field Notes, copied to docs/field-notes.
- New docs/report-writing.md; FAQ section on analysis and reporting with
  the related SOsintOps projects; setup.sh resources clones the notes.
- Fixed: launchers/lib/argos.sh declared 3.1.0-beta, so run folders
  recorded the wrong version; README version note and Bazzell title.
</commit_message>
<xml_diff>
--- a/templates/Argos_Event_Assessment.docx
+++ b/templates/Argos_Event_Assessment.docx
@@ -215,7 +215,7 @@
           <w:i/>
           <w:color w:val="595959"/>
         </w:rPr>
-        <w:t>[Bottom line first: overall risk level and the main reasons. Confidence: High = several independent, reliable sources agree; Moderate = credible but not fully corroborated; Low = single or questionable source, treat as a lead. Likelihood words: almost no chance, very unlikely, unlikely, roughly even chance, likely, very likely, almost certain.]</w:t>
+        <w:t>[Bottom line first: overall risk level and the main reasons. Confidence: High = several independent, reliable sources agree; Moderate = credible but not fully corroborated; Low = single or questionable source, treat as a lead. Likelihood words (ICD 203, one row only): almost no chance, very unlikely, unlikely, roughly even chance, likely, very likely, almost certain. Never put a confidence level and a likelihood word in the same sentence.]</w:t>
       </w:r>
     </w:p>
     <w:p>
@@ -1140,7 +1140,7 @@
           <w:i/>
           <w:color w:val="595959"/>
         </w:rPr>
-        <w:t>[One row per source. Run folder and SHA-256 come from the Argos run folder (command.txt and SHA256SUMS), so every statement can be traced back to the exact capture. Source reliability A (reliable) to F (cannot be judged); information credibility 1 (confirmed by other sources) to 6 (cannot be judged).]</w:t>
+        <w:t>[One row per source. Run folder and SHA-256 come from the Argos run folder (command.txt and SHA256SUMS), so every statement can be traced back to the exact capture. Grade (UNODC 4 x 4): source A = no doubt about reliability, B = mostly reliable, C = mostly unreliable, X = cannot be judged; information 1 = no doubt about accuracy, 2 = known personally to the source, 3 = not known personally but corroborated, 4 = not known personally and not corroborated. Grade the source and the information separately, e.g. B2.]</w:t>
       </w:r>
     </w:p>
     <w:tbl>
@@ -1253,7 +1253,7 @@
               <w:rPr>
                 <w:b/>
               </w:rPr>
-              <w:t>Rel./Cred.</w:t>
+              <w:t>Grade</w:t>
             </w:r>
           </w:p>
         </w:tc>

</xml_diff>